<commit_message>
BPP manuscript: clarify hospital counts as facility counts and add risk-perception limitation
Co-Authored-By: Tatsuki Onishi <bougtoir@gmail.com>
</commit_message>
<xml_diff>
--- a/medical_accident_its_analysis/manuscript/bmj_cover_letter.docx
+++ b/medical_accident_its_analysis/manuscript/bmj_cover_letter.docx
@@ -205,7 +205,7 @@
           <w:i w:val="0"/>
           <w:sz w:val="24"/>
         </w:rPr>
-        <w:t>Our principal findings are as follows. First, medical safety incidents are followed by reductions in specialty-specific physician supply, with an estimated lead time of 1–3 years and an effect duration of 4–5 years. Obstetrics and gynaecology showed the strongest and most consistent association (r = −0.95, lag +3 years). Second, the phenomenon extends well beyond obstetrics: otolaryngology (r = −0.97), dermatology (r = −0.99), and urology (r = −0.94) — specialties not traditionally considered 'high-risk' — also showed strong delayed inverse associations. Third, negative lag values observed for anaesthesiology (−4 years) and otolaryngology trainees (−3 years) suggest that the relationship may be bidirectional: workforce shortages may themselves precede and contribute to increased incident reporting, raising the possibility of a vicious cycle.</w:t>
+        <w:t>Our principal findings are as follows. First, medical safety incidents are followed by reductions in specialty-specific physician supply, with an estimated lead time of 1-3 years and an effect duration of 4-5 years. Obstetrics and gynaecology showed the strongest and most consistent association (r = -0.95, lag +3 years). Second, the phenomenon extends well beyond obstetrics: otolaryngology (r = -0.97), dermatology (r = -0.99), and urology (r = -0.94) — specialties not traditionally considered 'high-risk' — also showed strong delayed inverse associations. Third, negative lag values observed for anaesthesiology (-4 years) and otolaryngology trainees (-3 years) suggest that the relationship may be bidirectional: workforce shortages may themselves precede and contribute to increased incident reporting, raising the possibility of a vicious cycle.</w:t>
       </w:r>
     </w:p>
     <w:p>
@@ -219,7 +219,7 @@
           <w:i w:val="0"/>
           <w:sz w:val="24"/>
         </w:rPr>
-        <w:t>We believe this work is well suited to The BMJ for several reasons. The study addresses a gap at the intersection of patient safety and workforce policy — two topics of central importance to BMJ's readership. While previous work has documented the Fukushima obstetrics prosecution as a natural experiment affecting a single specialty, no study has systematically quantified the temporal parameters of the incident–workforce association across multiple specialties and definitions. The explicit estimation of lead time and window period parameters is methodologically novel and provides directly actionable inputs for workforce forecasting models. Furthermore, the finding that the relationship may be bidirectional — with workforce shortages potentially driving incidents as well as incidents driving workforce decline — has important implications for how health systems design both patient safety and workforce retention strategies.</w:t>
+        <w:t>We believe this work is well suited to The BMJ for several reasons. The study addresses a gap at the intersection of patient safety and workforce policy — two topics of central importance to BMJ's readership. While previous work has documented the Fukushima obstetrics prosecution as a natural experiment affecting a single specialty, no study has systematically quantified the temporal parameters of the incident-workforce association across multiple specialties and definitions. The explicit estimation of lead time and window period parameters is methodologically novel and provides directly actionable inputs for workforce forecasting models. Furthermore, the finding that the relationship may be bidirectional — with workforce shortages potentially driving incidents as well as incidents driving workforce decline — has important implications for how health systems design both patient safety and workforce retention strategies.</w:t>
       </w:r>
     </w:p>
     <w:p>
@@ -503,7 +503,7 @@
     <w:lvl w:ilvl="0">
       <w:start w:val="1"/>
       <w:numFmt w:val="bullet"/>
-      <w:lvlText w:val=""/>
+      <w:lvlText w:val="*"/>
       <w:lvlJc w:val="left"/>
       <w:pPr>
         <w:tabs>
@@ -524,7 +524,7 @@
       <w:start w:val="1"/>
       <w:numFmt w:val="bullet"/>
       <w:pStyle w:val="ListBullet3"/>
-      <w:lvlText w:val=""/>
+      <w:lvlText w:val="*"/>
       <w:lvlJc w:val="left"/>
       <w:pPr>
         <w:tabs>
@@ -545,7 +545,7 @@
       <w:start w:val="1"/>
       <w:numFmt w:val="bullet"/>
       <w:pStyle w:val="ListBullet2"/>
-      <w:lvlText w:val=""/>
+      <w:lvlText w:val="*"/>
       <w:lvlJc w:val="left"/>
       <w:pPr>
         <w:tabs>
@@ -584,7 +584,7 @@
       <w:start w:val="1"/>
       <w:numFmt w:val="bullet"/>
       <w:pStyle w:val="ListBullet"/>
-      <w:lvlText w:val=""/>
+      <w:lvlText w:val="*"/>
       <w:lvlJc w:val="left"/>
       <w:pPr>
         <w:tabs>
@@ -24328,10 +24328,10 @@
         <a:latin typeface="Calibri"/>
         <a:ea typeface=""/>
         <a:cs typeface=""/>
-        <a:font script="Jpan" typeface="ＭＳ ゴシック"/>
-        <a:font script="Hang" typeface="맑은 고딕"/>
-        <a:font script="Hans" typeface="宋体"/>
-        <a:font script="Hant" typeface="新細明體"/>
+        <a:font script="Jpan" typeface="MS Gothic"/>
+        <a:font script="Hang" typeface="Malgun Gothic"/>
+        <a:font script="Hans" typeface="SimSun"/>
+        <a:font script="Hant" typeface="PMingLiU"/>
         <a:font script="Arab" typeface="Times New Roman"/>
         <a:font script="Hebr" typeface="Times New Roman"/>
         <a:font script="Thai" typeface="Angsana New"/>
@@ -24363,10 +24363,10 @@
         <a:latin typeface="Cambria"/>
         <a:ea typeface=""/>
         <a:cs typeface=""/>
-        <a:font script="Jpan" typeface="ＭＳ 明朝"/>
-        <a:font script="Hang" typeface="맑은 고딕"/>
-        <a:font script="Hans" typeface="宋体"/>
-        <a:font script="Hant" typeface="新細明體"/>
+        <a:font script="Jpan" typeface="MS Mincho"/>
+        <a:font script="Hang" typeface="Malgun Gothic"/>
+        <a:font script="Hans" typeface="SimSun"/>
+        <a:font script="Hant" typeface="PMingLiU"/>
         <a:font script="Arab" typeface="Arial"/>
         <a:font script="Hebr" typeface="Arial"/>
         <a:font script="Thai" typeface="Cordia New"/>

</xml_diff>